<commit_message>
test(agent_tools): 工具层分支收口 78%->100%（+30 条），全量 502/93%
- 新增 tests/test_agent_tools_coverage.py（30 条）：读工具过滤分支、写工具成功路径、
  注册表自检、参数收敛、confirm 兜底
- 新增 scripts/regression.py：一键回归（pytest+覆盖率 -> 起服体检 -> HTTP 冒烟 -> E2E）
- 基线同步 472/91% -> 502/93%：README、验收基线汇总、需求完成情况查验报告(md/html)、
  代码实现与测试查验报告（新增 §七）、SKILLS.md、final_draft.md、stage2 HTML、技术 docx
- 发现并记录 _screening_batch 的 lead_ids 拼文本在 try 之外（单条失败会炸整批），未改，待确认
</commit_message>
<xml_diff>
--- a/01-需求与技术文档/AI智能助手系统_技术实现与部署文档.docx
+++ b/01-需求与技术文档/AI智能助手系统_技术实现与部署文档.docx
@@ -10125,7 +10125,7 @@
           <w:b w:val="1"/>
           <w:lang w:eastAsia="zh-CN"/>
         </w:rPr>
-        <w:t>离线可测。 完整的 472 条自动化测试与 149 条冒烟测试全部在无 Dify 实例的环境下运行并通过。</w:t>
+        <w:t>离线可测。 完整的 502 条自动化测试与 149 条冒烟测试全部在无 Dify 实例的环境下运行并通过。</w:t>
       </w:r>
       <w:r/>
       <w:r>
@@ -17233,7 +17233,7 @@
           <w:b w:val="1"/>
           <w:lang w:eastAsia="zh-CN"/>
         </w:rPr>
-        <w:t>实测结果：472 条用例全部通过，整体覆盖率 91%。</w:t>
+        <w:t>实测结果：502 条用例全部通过，整体覆盖率 93%。</w:t>
       </w:r>
       <w:r>
         <w:rPr>
@@ -18342,7 +18342,7 @@
               <w:rPr>
                 <w:sz w:val="18"/>
               </w:rPr>
-              <w:t xml:space="preserve">api/v1/org.py</w:t>
+              <w:t xml:space="preserve">services/agent_tools.py</w:t>
             </w:r>
           </w:p>
         </w:tc>
@@ -18371,7 +18371,7 @@
               <w:rPr>
                 <w:sz w:val="18"/>
               </w:rPr>
-              <w:t xml:space="preserve">98%</w:t>
+              <w:t>100%</w:t>
             </w:r>
           </w:p>
         </w:tc>
@@ -18401,7 +18401,7 @@
                 <w:rFonts w:hint="eastAsia"/>
                 <w:sz w:val="18"/>
               </w:rPr>
-              <w:t xml:space="preserve">组织架构与入职指引接口</w:t>
+              <w:t xml:space="preserve">内部工具注册表（26 个工具的 Schema 与角色门槛）</w:t>
             </w:r>
           </w:p>
         </w:tc>
@@ -18433,7 +18433,7 @@
               <w:rPr>
                 <w:sz w:val="18"/>
               </w:rPr>
-              <w:t xml:space="preserve">api/v1/todo.py</w:t>
+              <w:t xml:space="preserve">api/v1/org.py</w:t>
             </w:r>
           </w:p>
         </w:tc>
@@ -18462,7 +18462,7 @@
               <w:rPr>
                 <w:sz w:val="18"/>
               </w:rPr>
-              <w:t xml:space="preserve">97%</w:t>
+              <w:t xml:space="preserve">98%</w:t>
             </w:r>
           </w:p>
         </w:tc>
@@ -18492,7 +18492,7 @@
                 <w:rFonts w:hint="eastAsia"/>
                 <w:sz w:val="18"/>
               </w:rPr>
-              <w:t xml:space="preserve">主动待办与推送留痕接口</w:t>
+              <w:t xml:space="preserve">组织架构与入职指引接口</w:t>
             </w:r>
           </w:p>
         </w:tc>
@@ -18524,7 +18524,7 @@
               <w:rPr>
                 <w:sz w:val="18"/>
               </w:rPr>
-              <w:t xml:space="preserve">config.py</w:t>
+              <w:t xml:space="preserve">api/v1/todo.py</w:t>
             </w:r>
           </w:p>
         </w:tc>
@@ -18583,7 +18583,7 @@
                 <w:rFonts w:hint="eastAsia"/>
                 <w:sz w:val="18"/>
               </w:rPr>
-              <w:t xml:space="preserve">配置加载与校验</w:t>
+              <w:t xml:space="preserve">主动待办与推送留痕接口</w:t>
             </w:r>
           </w:p>
         </w:tc>
@@ -18615,7 +18615,7 @@
               <w:rPr>
                 <w:sz w:val="18"/>
               </w:rPr>
-              <w:t xml:space="preserve">db.py</w:t>
+              <w:t xml:space="preserve">config.py</w:t>
             </w:r>
           </w:p>
         </w:tc>
@@ -18644,7 +18644,7 @@
               <w:rPr>
                 <w:sz w:val="18"/>
               </w:rPr>
-              <w:t xml:space="preserve">96%</w:t>
+              <w:t xml:space="preserve">97%</w:t>
             </w:r>
           </w:p>
         </w:tc>
@@ -18674,7 +18674,7 @@
                 <w:rFonts w:hint="eastAsia"/>
                 <w:sz w:val="18"/>
               </w:rPr>
-              <w:t xml:space="preserve">数据库层（补列 / 默认值渲染；MySQL 方言分支离线不可达）</w:t>
+              <w:t xml:space="preserve">配置加载与校验</w:t>
             </w:r>
           </w:p>
         </w:tc>
@@ -18706,7 +18706,7 @@
               <w:rPr>
                 <w:sz w:val="18"/>
               </w:rPr>
-              <w:t xml:space="preserve">services/reports.py</w:t>
+              <w:t xml:space="preserve">db.py</w:t>
             </w:r>
           </w:p>
         </w:tc>
@@ -18765,7 +18765,7 @@
                 <w:rFonts w:hint="eastAsia"/>
                 <w:sz w:val="18"/>
               </w:rPr>
-              <w:t xml:space="preserve">五类报告聚合与四出口渲染</w:t>
+              <w:t xml:space="preserve">数据库层（补列 / 默认值渲染；MySQL 方言分支离线不可达）</w:t>
             </w:r>
           </w:p>
         </w:tc>
@@ -18797,7 +18797,7 @@
               <w:rPr>
                 <w:sz w:val="18"/>
               </w:rPr>
-              <w:t xml:space="preserve">api/v1/data.py</w:t>
+              <w:t xml:space="preserve">services/reports.py</w:t>
             </w:r>
           </w:p>
         </w:tc>
@@ -18826,7 +18826,7 @@
               <w:rPr>
                 <w:sz w:val="18"/>
               </w:rPr>
-              <w:t xml:space="preserve">95%</w:t>
+              <w:t xml:space="preserve">96%</w:t>
             </w:r>
           </w:p>
         </w:tc>
@@ -18856,7 +18856,7 @@
                 <w:rFonts w:hint="eastAsia"/>
                 <w:sz w:val="18"/>
               </w:rPr>
-              <w:t xml:space="preserve">数据洞察接口</w:t>
+              <w:t xml:space="preserve">五类报告聚合与四出口渲染</w:t>
             </w:r>
           </w:p>
         </w:tc>
@@ -18888,7 +18888,7 @@
               <w:rPr>
                 <w:sz w:val="18"/>
               </w:rPr>
-              <w:t xml:space="preserve">services/todo.py</w:t>
+              <w:t xml:space="preserve">api/v1/data.py</w:t>
             </w:r>
           </w:p>
         </w:tc>
@@ -18947,7 +18947,7 @@
                 <w:rFonts w:hint="eastAsia"/>
                 <w:sz w:val="18"/>
               </w:rPr>
-              <w:t xml:space="preserve">待办现场计算、推送幂等与预警触达</w:t>
+              <w:t xml:space="preserve">数据洞察接口</w:t>
             </w:r>
           </w:p>
         </w:tc>
@@ -18979,7 +18979,7 @@
               <w:rPr>
                 <w:sz w:val="18"/>
               </w:rPr>
-              <w:t xml:space="preserve">services/xlsx_writer.py</w:t>
+              <w:t xml:space="preserve">services/todo.py</w:t>
             </w:r>
           </w:p>
         </w:tc>
@@ -19008,7 +19008,7 @@
               <w:rPr>
                 <w:sz w:val="18"/>
               </w:rPr>
-              <w:t xml:space="preserve">94%</w:t>
+              <w:t xml:space="preserve">95%</w:t>
             </w:r>
           </w:p>
         </w:tc>
@@ -19038,7 +19038,7 @@
                 <w:rFonts w:hint="eastAsia"/>
                 <w:sz w:val="18"/>
               </w:rPr>
-              <w:t xml:space="preserve">纯标准库写 xlsx</w:t>
+              <w:t xml:space="preserve">待办现场计算、推送幂等与预警触达</w:t>
             </w:r>
           </w:p>
         </w:tc>
@@ -19070,7 +19070,7 @@
               <w:rPr>
                 <w:sz w:val="18"/>
               </w:rPr>
-              <w:t xml:space="preserve">api/v1/ops.py</w:t>
+              <w:t xml:space="preserve">services/xlsx_writer.py</w:t>
             </w:r>
           </w:p>
         </w:tc>
@@ -19129,7 +19129,7 @@
                 <w:rFonts w:hint="eastAsia"/>
                 <w:sz w:val="18"/>
               </w:rPr>
-              <w:t xml:space="preserve">运营域接口（含报告导出）</w:t>
+              <w:t xml:space="preserve">纯标准库写 xlsx</w:t>
             </w:r>
           </w:p>
         </w:tc>
@@ -19161,7 +19161,7 @@
               <w:rPr>
                 <w:sz w:val="18"/>
               </w:rPr>
-              <w:t xml:space="preserve">services/nl2sql.py</w:t>
+              <w:t xml:space="preserve">api/v1/ops.py</w:t>
             </w:r>
           </w:p>
         </w:tc>
@@ -19220,7 +19220,7 @@
                 <w:rFonts w:hint="eastAsia"/>
                 <w:sz w:val="18"/>
               </w:rPr>
-              <w:t xml:space="preserve">受控 SQL</w:t>
+              <w:t xml:space="preserve">运营域接口（含报告导出）</w:t>
             </w:r>
           </w:p>
         </w:tc>
@@ -19252,7 +19252,7 @@
               <w:rPr>
                 <w:sz w:val="18"/>
               </w:rPr>
-              <w:t xml:space="preserve">services/onboarding.py</w:t>
+              <w:t xml:space="preserve">services/nl2sql.py</w:t>
             </w:r>
           </w:p>
         </w:tc>
@@ -19281,7 +19281,7 @@
               <w:rPr>
                 <w:sz w:val="18"/>
               </w:rPr>
-              <w:t xml:space="preserve">93%</w:t>
+              <w:t xml:space="preserve">94%</w:t>
             </w:r>
           </w:p>
         </w:tc>
@@ -19311,7 +19311,7 @@
                 <w:rFonts w:hint="eastAsia"/>
                 <w:sz w:val="18"/>
               </w:rPr>
-              <w:t xml:space="preserve">入职指引内容资产与联系人解析</w:t>
+              <w:t xml:space="preserve">受控 SQL</w:t>
             </w:r>
           </w:p>
         </w:tc>
@@ -19343,7 +19343,7 @@
               <w:rPr>
                 <w:sz w:val="18"/>
               </w:rPr>
-              <w:t xml:space="preserve">core.py</w:t>
+              <w:t xml:space="preserve">services/onboarding.py</w:t>
             </w:r>
           </w:p>
         </w:tc>
@@ -19372,7 +19372,7 @@
               <w:rPr>
                 <w:sz w:val="18"/>
               </w:rPr>
-              <w:t xml:space="preserve">92%</w:t>
+              <w:t xml:space="preserve">93%</w:t>
             </w:r>
           </w:p>
         </w:tc>
@@ -19402,7 +19402,7 @@
                 <w:rFonts w:hint="eastAsia"/>
                 <w:sz w:val="18"/>
               </w:rPr>
-              <w:t xml:space="preserve">核心工具</w:t>
+              <w:t xml:space="preserve">入职指引内容资产与联系人解析</w:t>
             </w:r>
           </w:p>
         </w:tc>
@@ -19434,7 +19434,7 @@
               <w:rPr>
                 <w:sz w:val="18"/>
               </w:rPr>
-              <w:t xml:space="preserve">api/v1/crm.py</w:t>
+              <w:t xml:space="preserve">core.py</w:t>
             </w:r>
           </w:p>
         </w:tc>
@@ -19493,7 +19493,7 @@
                 <w:rFonts w:hint="eastAsia"/>
                 <w:sz w:val="18"/>
               </w:rPr>
-              <w:t xml:space="preserve">客户域接口（含材料上传解析、复核、批量研判）</w:t>
+              <w:t xml:space="preserve">核心工具</w:t>
             </w:r>
           </w:p>
         </w:tc>
@@ -19525,7 +19525,7 @@
               <w:rPr>
                 <w:sz w:val="18"/>
               </w:rPr>
-              <w:t xml:space="preserve">api/v1/tools.py</w:t>
+              <w:t xml:space="preserve">api/v1/crm.py</w:t>
             </w:r>
           </w:p>
         </w:tc>
@@ -19554,7 +19554,7 @@
               <w:rPr>
                 <w:sz w:val="18"/>
               </w:rPr>
-              <w:t xml:space="preserve">91%</w:t>
+              <w:t xml:space="preserve">92%</w:t>
             </w:r>
           </w:p>
         </w:tc>
@@ -19584,7 +19584,7 @@
                 <w:rFonts w:hint="eastAsia"/>
                 <w:sz w:val="18"/>
               </w:rPr>
-              <w:t xml:space="preserve">内部工具接口入口</w:t>
+              <w:t xml:space="preserve">客户域接口（含材料上传解析、复核、批量研判）</w:t>
             </w:r>
           </w:p>
         </w:tc>
@@ -19616,7 +19616,7 @@
               <w:rPr>
                 <w:sz w:val="18"/>
               </w:rPr>
-              <w:t xml:space="preserve">api/v1/student.py</w:t>
+              <w:t xml:space="preserve">api/v1/tools.py</w:t>
             </w:r>
           </w:p>
         </w:tc>
@@ -19675,7 +19675,7 @@
                 <w:rFonts w:hint="eastAsia"/>
                 <w:sz w:val="18"/>
               </w:rPr>
-              <w:t xml:space="preserve">学员域接口</w:t>
+              <w:t xml:space="preserve">内部工具接口入口</w:t>
             </w:r>
           </w:p>
         </w:tc>
@@ -19707,7 +19707,7 @@
               <w:rPr>
                 <w:sz w:val="18"/>
               </w:rPr>
-              <w:t xml:space="preserve">services/intent.py</w:t>
+              <w:t xml:space="preserve">api/v1/student.py</w:t>
             </w:r>
           </w:p>
         </w:tc>
@@ -19736,7 +19736,7 @@
               <w:rPr>
                 <w:sz w:val="18"/>
               </w:rPr>
-              <w:t xml:space="preserve">90%</w:t>
+              <w:t xml:space="preserve">91%</w:t>
             </w:r>
           </w:p>
         </w:tc>
@@ -19766,7 +19766,7 @@
                 <w:rFonts w:hint="eastAsia"/>
                 <w:sz w:val="18"/>
               </w:rPr>
-              <w:t xml:space="preserve">意图路由</w:t>
+              <w:t xml:space="preserve">学员域接口</w:t>
             </w:r>
           </w:p>
         </w:tc>
@@ -19798,7 +19798,7 @@
               <w:rPr>
                 <w:sz w:val="18"/>
               </w:rPr>
-              <w:t xml:space="preserve">api/deps.py</w:t>
+              <w:t xml:space="preserve">services/intent.py</w:t>
             </w:r>
           </w:p>
         </w:tc>
@@ -19857,7 +19857,7 @@
                 <w:rFonts w:hint="eastAsia"/>
                 <w:sz w:val="18"/>
               </w:rPr>
-              <w:t xml:space="preserve">鉴权依赖</w:t>
+              <w:t xml:space="preserve">意图路由</w:t>
             </w:r>
           </w:p>
         </w:tc>
@@ -19889,7 +19889,7 @@
               <w:rPr>
                 <w:sz w:val="18"/>
               </w:rPr>
-              <w:t xml:space="preserve">services/deadline.py</w:t>
+              <w:t xml:space="preserve">api/deps.py</w:t>
             </w:r>
           </w:p>
         </w:tc>
@@ -19918,7 +19918,7 @@
               <w:rPr>
                 <w:sz w:val="18"/>
               </w:rPr>
-              <w:t xml:space="preserve">89%</w:t>
+              <w:t xml:space="preserve">90%</w:t>
             </w:r>
           </w:p>
         </w:tc>
@@ -19948,7 +19948,7 @@
                 <w:rFonts w:hint="eastAsia"/>
                 <w:sz w:val="18"/>
               </w:rPr>
-              <w:t xml:space="preserve">学业考务与考前提醒</w:t>
+              <w:t xml:space="preserve">鉴权依赖</w:t>
             </w:r>
           </w:p>
         </w:tc>
@@ -19980,7 +19980,7 @@
               <w:rPr>
                 <w:sz w:val="18"/>
               </w:rPr>
-              <w:t xml:space="preserve">services/rules.py</w:t>
+              <w:t xml:space="preserve">services/deadline.py</w:t>
             </w:r>
           </w:p>
         </w:tc>
@@ -20039,7 +20039,7 @@
                 <w:rFonts w:hint="eastAsia"/>
                 <w:sz w:val="18"/>
               </w:rPr>
-              <w:t xml:space="preserve">画像研判规则引擎</w:t>
+              <w:t xml:space="preserve">学业考务与考前提醒</w:t>
             </w:r>
           </w:p>
         </w:tc>
@@ -20071,7 +20071,7 @@
               <w:rPr>
                 <w:sz w:val="18"/>
               </w:rPr>
-              <w:t xml:space="preserve">api/v1/chat.py</w:t>
+              <w:t xml:space="preserve">services/rules.py</w:t>
             </w:r>
           </w:p>
         </w:tc>
@@ -20100,7 +20100,7 @@
               <w:rPr>
                 <w:sz w:val="18"/>
               </w:rPr>
-              <w:t xml:space="preserve">88%</w:t>
+              <w:t xml:space="preserve">89%</w:t>
             </w:r>
           </w:p>
         </w:tc>
@@ -20130,7 +20130,7 @@
                 <w:rFonts w:hint="eastAsia"/>
                 <w:sz w:val="18"/>
               </w:rPr>
-              <w:t xml:space="preserve">对话接口（含编排输入注入与会话重试）</w:t>
+              <w:t xml:space="preserve">画像研判规则引擎</w:t>
             </w:r>
           </w:p>
         </w:tc>
@@ -20162,7 +20162,7 @@
               <w:rPr>
                 <w:sz w:val="18"/>
               </w:rPr>
-              <w:t xml:space="preserve">services/pdf_writer.py</w:t>
+              <w:t xml:space="preserve">api/v1/chat.py</w:t>
             </w:r>
           </w:p>
         </w:tc>
@@ -20221,7 +20221,7 @@
                 <w:rFonts w:hint="eastAsia"/>
                 <w:sz w:val="18"/>
               </w:rPr>
-              <w:t xml:space="preserve">纯标准库写 PDF</w:t>
+              <w:t xml:space="preserve">对话接口（含编排输入注入与会话重试）</w:t>
             </w:r>
           </w:p>
         </w:tc>
@@ -20253,7 +20253,7 @@
               <w:rPr>
                 <w:sz w:val="18"/>
               </w:rPr>
-              <w:t xml:space="preserve">services/dify.py</w:t>
+              <w:t xml:space="preserve">services/pdf_writer.py</w:t>
             </w:r>
           </w:p>
         </w:tc>
@@ -20282,7 +20282,7 @@
               <w:rPr>
                 <w:sz w:val="18"/>
               </w:rPr>
-              <w:t xml:space="preserve">85%</w:t>
+              <w:t xml:space="preserve">88%</w:t>
             </w:r>
           </w:p>
         </w:tc>
@@ -20312,7 +20312,7 @@
                 <w:rFonts w:hint="eastAsia"/>
                 <w:sz w:val="18"/>
               </w:rPr>
-              <w:t xml:space="preserve">Dify 客户端（mock/live 双模与降级）</w:t>
+              <w:t xml:space="preserve">纯标准库写 PDF</w:t>
             </w:r>
           </w:p>
         </w:tc>
@@ -20344,7 +20344,7 @@
               <w:rPr>
                 <w:sz w:val="18"/>
               </w:rPr>
-              <w:t xml:space="preserve">services/material.py</w:t>
+              <w:t xml:space="preserve">services/dify.py</w:t>
             </w:r>
           </w:p>
         </w:tc>
@@ -20373,7 +20373,7 @@
               <w:rPr>
                 <w:sz w:val="18"/>
               </w:rPr>
-              <w:t xml:space="preserve">82%</w:t>
+              <w:t xml:space="preserve">85%</w:t>
             </w:r>
           </w:p>
         </w:tc>
@@ -20403,7 +20403,7 @@
                 <w:rFonts w:hint="eastAsia"/>
                 <w:sz w:val="18"/>
               </w:rPr>
-              <w:t xml:space="preserve">材料解析与字段抽取（双路并存）</w:t>
+              <w:t xml:space="preserve">Dify 客户端（mock/live 双模与降级）</w:t>
             </w:r>
           </w:p>
         </w:tc>
@@ -20435,7 +20435,7 @@
               <w:rPr>
                 <w:sz w:val="18"/>
               </w:rPr>
-              <w:t xml:space="preserve">services/mock_agent.py</w:t>
+              <w:t xml:space="preserve">services/material.py</w:t>
             </w:r>
           </w:p>
         </w:tc>
@@ -20494,7 +20494,7 @@
                 <w:rFonts w:hint="eastAsia"/>
                 <w:sz w:val="18"/>
               </w:rPr>
-              <w:t xml:space="preserve">mock 模式本地编排</w:t>
+              <w:t xml:space="preserve">材料解析与字段抽取（双路并存）</w:t>
             </w:r>
           </w:p>
         </w:tc>
@@ -20526,7 +20526,7 @@
               <w:rPr>
                 <w:sz w:val="18"/>
               </w:rPr>
-              <w:t xml:space="preserve">services/agent_tools.py</w:t>
+              <w:t xml:space="preserve">services/mock_agent.py</w:t>
             </w:r>
           </w:p>
         </w:tc>
@@ -20555,7 +20555,7 @@
               <w:rPr>
                 <w:sz w:val="18"/>
               </w:rPr>
-              <w:t xml:space="preserve">78%</w:t>
+              <w:t xml:space="preserve">82%</w:t>
             </w:r>
           </w:p>
         </w:tc>
@@ -20585,7 +20585,7 @@
                 <w:rFonts w:hint="eastAsia"/>
                 <w:sz w:val="18"/>
               </w:rPr>
-              <w:t xml:space="preserve">内部工具注册表（26 个工具的 Schema 与角色门槛）</w:t>
+              <w:t xml:space="preserve">mock 模式本地编排</w:t>
             </w:r>
           </w:p>
         </w:tc>
@@ -20598,13 +20598,13 @@
           <w:b/>
           <w:lang w:eastAsia="zh-CN"/>
         </w:rPr>
-        <w:t>关于 10% 未覆盖部分的说明。</w:t>
+        <w:t>关于 7% 未覆盖部分的说明。</w:t>
       </w:r>
       <w:r>
         <w:rPr>
           <w:rFonts w:ascii="微软雅黑" w:hAnsi="微软雅黑"/>
         </w:rPr>
-        <w:t xml:space="preserve"> 缺口集中在两类离线不可达的分支：app/services/dify.py 的 live 模式路径、以及 app/db.py 的 MySQL 连接池分支。此外 app/services/agent_tools.py（内部工具注册表，26 个工具的 Schema 与处理器）虽然鉴权通道、角色门槛与写入守卫都有单元测试覆盖，但其中相当一部分处理器是专为 live 编排链路准备的，需要真实 Dify 实例与真实业务数据才能端到端触发，因此单测覆盖率（78%）仍低于整体水平——这部分缺口由编排侧的逐分支联调补上。以上都依赖真实外部依赖（MySQL 实例、常驻进程、Dify 服务）才能在测试中触发，属于已知且被接受的缺口。项目通过把 mock / 前台触发设计为默认路径，使其余全部业务逻辑都在测试覆盖之内。上线前建议在预发环境针对 live 模式与 MySQL 补一轮集成验证。</w:t>
+        <w:t xml:space="preserve"> 缺口集中在两类离线不可达的分支：app/services/dify.py 的 live 模式路径、以及 app/db.py 的 MySQL 连接池分支。app/services/agent_tools.py（内部工具注册表，26 个工具的 Schema 与处理器）此前因部分处理器需真实 Dify 实例与业务数据才能端到端触发，覆盖率仅 78%；现已补测读工具过滤分支、写工具成功路径与注册期自检，收口到 100%。以上都依赖真实外部依赖（MySQL 实例、常驻进程、Dify 服务）才能在测试中触发，属于已知且被接受的缺口。项目通过把 mock / 前台触发设计为默认路径，使其余全部业务逻辑都在测试覆盖之内。上线前建议在预发环境针对 live 模式与 MySQL 补一轮集成验证。</w:t>
       </w:r>
       <w:r>
         <w:rPr>
@@ -23303,7 +23303,7 @@
                 <w:rFonts w:hint="eastAsia"/>
                 <w:sz w:val="18"/>
               </w:rPr>
-              <w:t>472 / 472 通过</w:t>
+              <w:t>502 / 502 通过</w:t>
             </w:r>
           </w:p>
         </w:tc>
@@ -23425,7 +23425,7 @@
               <w:rPr>
                 <w:sz w:val="18"/>
               </w:rPr>
-              <w:t>91%</w:t>
+              <w:t>93%</w:t>
             </w:r>
           </w:p>
         </w:tc>
@@ -24271,7 +24271,7 @@
           <w:b/>
           <w:lang w:eastAsia="zh-CN"/>
         </w:rPr>
-        <w:t>Dify live 模式已打通，但尚未纳入自动化回归。 本机已部署真实 Dify 实例，完成 7 个应用的接线与逐分支联调，并针对跨应用会话、跨角色越权、知识库命中三类场景做了实测；但该分支依赖外部实例与云端模型服务，未进入日常测试链路。日常回归仍由 mock 分支保证可测性（472 条用例全部离线通过）。建议在预发环境把它做成定期集成验证。</w:t>
+        <w:t>Dify live 模式已打通，但尚未纳入自动化回归。 本机已部署真实 Dify 实例，完成 7 个应用的接线与逐分支联调，并针对跨应用会话、跨角色越权、知识库命中三类场景做了实测；但该分支依赖外部实例与云端模型服务，未进入日常测试链路。日常回归仍由 mock 分支保证可测性（502 条用例全部离线通过）。建议在预发环境把它做成定期集成验证。</w:t>
       </w:r>
       <w:r>
         <w:rPr>
@@ -26169,7 +26169,7 @@
                 <w:rFonts w:hint="eastAsia"/>
                 <w:sz w:val="18"/>
               </w:rPr>
-              <w:t>472 条，覆盖率 91%</w:t>
+              <w:t>502 条，覆盖率 93%</w:t>
             </w:r>
           </w:p>
         </w:tc>

</xml_diff>

<commit_message>
feat(security/ops): 接口限流 + /health 监控探针
- services/ratelimit.py：进程内滑动窗口（纯标准库）。/auth/token 每 IP 30/min（密码校验前拦）；
  /chat/message 与 /chat/stream 每账号 120/min（意图路由前拦，流式同桶防绕行）。
  429 + code=42900 + data.retry_after；RATE_LIMIT_ENABLED/AUTH/CHAT 三个配置项
- services/metrics.py + 中间件记账：/health 新增 metrics（请求总量/错误/p50/p95、
  对话 dispatch/clarify/fallback 分布与占比、平均置信度、对话 p95、Top5 意图、限流拒绝）
- core: TooManyRequests(42900)
- tests/test_rate_limit_metrics.py（9 条，两新模块 100%）；conftest 阈值调高防误伤
- 回归全绿：512 passed / 93% + 体检/冒烟/E2E 23 项；接口面不变
- 报告：查验报告新增 §九、验收基线汇总新增 §九；基线数字 503→512 全量同步
</commit_message>
<xml_diff>
--- a/01-需求与技术文档/AI智能助手系统_技术实现与部署文档.docx
+++ b/01-需求与技术文档/AI智能助手系统_技术实现与部署文档.docx
@@ -10125,7 +10125,7 @@
           <w:b w:val="1"/>
           <w:lang w:eastAsia="zh-CN"/>
         </w:rPr>
-        <w:t>离线可测。 完整的 503 条自动化测试与 149 条冒烟测试全部在无 Dify 实例的环境下运行并通过。</w:t>
+        <w:t>离线可测。 完整的 512 条自动化测试与 149 条冒烟测试全部在无 Dify 实例的环境下运行并通过。</w:t>
       </w:r>
       <w:r/>
       <w:r>
@@ -17233,7 +17233,7 @@
           <w:b w:val="1"/>
           <w:lang w:eastAsia="zh-CN"/>
         </w:rPr>
-        <w:t>实测结果：503 条用例全部通过，整体覆盖率 93%。</w:t>
+        <w:t>实测结果：512 条用例全部通过，整体覆盖率 93%。</w:t>
       </w:r>
       <w:r>
         <w:rPr>
@@ -23303,7 +23303,7 @@
                 <w:rFonts w:hint="eastAsia"/>
                 <w:sz w:val="18"/>
               </w:rPr>
-              <w:t>503 / 503 通过</w:t>
+              <w:t>512 / 512 通过</w:t>
             </w:r>
           </w:p>
         </w:tc>
@@ -24271,7 +24271,7 @@
           <w:b/>
           <w:lang w:eastAsia="zh-CN"/>
         </w:rPr>
-        <w:t>Dify live 模式已打通，但尚未纳入自动化回归。 本机已部署真实 Dify 实例，完成 7 个应用的接线与逐分支联调，并针对跨应用会话、跨角色越权、知识库命中三类场景做了实测；但该分支依赖外部实例与云端模型服务，未进入日常测试链路。日常回归仍由 mock 分支保证可测性（503 条用例全部离线通过）。建议在预发环境把它做成定期集成验证。</w:t>
+        <w:t>Dify live 模式已打通，但尚未纳入自动化回归。 本机已部署真实 Dify 实例，完成 7 个应用的接线与逐分支联调，并针对跨应用会话、跨角色越权、知识库命中三类场景做了实测；但该分支依赖外部实例与云端模型服务，未进入日常测试链路。日常回归仍由 mock 分支保证可测性（512 条用例全部离线通过）。建议在预发环境把它做成定期集成验证。</w:t>
       </w:r>
       <w:r>
         <w:rPr>
@@ -26169,7 +26169,7 @@
                 <w:rFonts w:hint="eastAsia"/>
                 <w:sz w:val="18"/>
               </w:rPr>
-              <w:t>503 条，覆盖率 93%</w:t>
+              <w:t>512 条，覆盖率 93%</w:t>
             </w:r>
           </w:p>
         </w:tc>

</xml_diff>

<commit_message>
security(agent_tools): lead_query 按 owner 行级收敛（方案 A），两条入口口径统一
- _lead_query：非 manager 强制 owner_id 收敛（显式 owner 参数也翻不出去）；
  manager/admin 全量；身份不可确认 → 空结果 + hint（fail closed）
- 新增 _operator_employee_id()：actor → SysAccount → employee ref_id（在职 + 员工角色 + 有 ref_id）
- 返回新增 scope（all / own / unknown_operator）
- 测试：+2（行级 scope、身份解析覆盖停用/学生/不存在账号）；test_tool_lead_lookup 改写新契约，
  静态 Key 两用例同步带 actor
- ⚠️ 部署配套：工具通道必须传操作人登录账号名（actor），否则员工查不到数据（刻意 fail closed）
- 回归：533 passed / 93%（agent_tools 仍 100%）；冒烟 3 条失败系本机 Dify 掉线，mock 模式 149/149
- 报告：查验报告 §十一、验收基线汇总 §十一；基线 531→533 全量同步；待办 rvqUBB 闭环
</commit_message>
<xml_diff>
--- a/01-需求与技术文档/AI智能助手系统_技术实现与部署文档.docx
+++ b/01-需求与技术文档/AI智能助手系统_技术实现与部署文档.docx
@@ -10125,7 +10125,7 @@
           <w:b w:val="1"/>
           <w:lang w:eastAsia="zh-CN"/>
         </w:rPr>
-        <w:t>离线可测。 完整的 531 条自动化测试与 149 条冒烟测试全部在无 Dify 实例的环境下运行并通过。</w:t>
+        <w:t>离线可测。 完整的 533 条自动化测试与 149 条冒烟测试全部在无 Dify 实例的环境下运行并通过。</w:t>
       </w:r>
       <w:r/>
       <w:r>
@@ -17233,7 +17233,7 @@
           <w:b w:val="1"/>
           <w:lang w:eastAsia="zh-CN"/>
         </w:rPr>
-        <w:t>实测结果：531 条用例全部通过，整体覆盖率 93%。</w:t>
+        <w:t>实测结果：533 条用例全部通过，整体覆盖率 93%。</w:t>
       </w:r>
       <w:r>
         <w:rPr>
@@ -23485,7 +23485,7 @@
                 <w:rFonts w:hint="eastAsia"/>
                 <w:sz w:val="18"/>
               </w:rPr>
-              <w:t>531 / 531 通过</w:t>
+              <w:t>533 / 533 通过</w:t>
             </w:r>
           </w:p>
         </w:tc>
@@ -24453,7 +24453,7 @@
           <w:b/>
           <w:lang w:eastAsia="zh-CN"/>
         </w:rPr>
-        <w:t>Dify live 模式已打通，但尚未纳入自动化回归。 本机已部署真实 Dify 实例，完成 7 个应用的接线与逐分支联调，并针对跨应用会话、跨角色越权、知识库命中三类场景做了实测；但该分支依赖外部实例与云端模型服务，未进入日常测试链路。日常回归仍由 mock 分支保证可测性（531 条用例全部离线通过）。建议在预发环境把它做成定期集成验证。</w:t>
+        <w:t>Dify live 模式已打通，但尚未纳入自动化回归。 本机已部署真实 Dify 实例，完成 7 个应用的接线与逐分支联调，并针对跨应用会话、跨角色越权、知识库命中三类场景做了实测；但该分支依赖外部实例与云端模型服务，未进入日常测试链路。日常回归仍由 mock 分支保证可测性（533 条用例全部离线通过）。建议在预发环境把它做成定期集成验证。</w:t>
       </w:r>
       <w:r>
         <w:rPr>
@@ -26351,7 +26351,7 @@
                 <w:rFonts w:hint="eastAsia"/>
                 <w:sz w:val="18"/>
               </w:rPr>
-              <w:t>531 条，覆盖率 93%</w:t>
+              <w:t>533 条，覆盖率 93%</w:t>
             </w:r>
           </w:p>
         </w:tc>

</xml_diff>